<commit_message>
RAC 17장 수정 — restore spfile to 는 비파괴가 아니다
19장 측정 중 srvctl config database 의 Spfile 이 /tmp/spfile_ch17_test.ora
로 바뀌어 있는 것을 발견했다. 17장에서 이 명령을 "비파괴적" 이라고 서술한
것이 틀렸다.

대조 실험으로 원인을 특정
  복원 전                          Spfile: +DATA/RACDB/PARAMETERFILE/spfile.272...
  backup current controlfile 후    변화 없음
  restore spfile to '/tmp/...' 후  Spfile: /tmp/sp_probe.ora

실행 중인 인스턴스는 영향을 받지 않으므로(gv$parameter 는 여전히 +DATA)
그날은 정상으로 보이고 다음 srvctl 기동에서 문제가 드러난다.

수정 내용
- 본문에 17.7.4 "읽기 전용처럼 보이지만 아니다" 절과 @BP 추가, 요약 보강
- PPT 슬라이드 2장 추가 (부작용 / 원복 절차), 정리 슬라이드에 원복 항목
- 실습 07 에 [3-1] 오류 재현 절 추가, 헤더의 "비파괴" 표현 삭제,
  정리·기준선·점검 항목에 SPFILE 등록 경로 확인 추가
- 상-08 문항과 정답을 부작용 중심으로 교체

랩은 srvctl modify database -spfile 로 원복 완료.

Co-Authored-By: Claude Opus 5 (1M context) <noreply@anthropic.com>
</commit_message>
<xml_diff>
--- a/RAC/17장/17장_RAC백업과복구.docx
+++ b/RAC/17장/17장_RAC백업과복구.docx
@@ -189,15 +189,6 @@
       </w:tr>
     </w:tbl>
     <w:p/>
-    <w:p>
-      <w:r>
-        <w:rPr>
-          <w:rFonts w:ascii="맑은 고딕" w:hAnsi="맑은 고딕" w:eastAsia="맑은 고딕"/>
-          <w:sz w:val="21"/>
-        </w:rPr>
-        <w:t>이 랩은 NOARCHIVELOG 로 만들어져 있다. dbca 의 기본값이며 10장에서 온라인 데이터파일 복사가 막혔던 이유이기도 하다.</w:t>
-      </w:r>
-    </w:p>
     <w:tbl>
       <w:tblPr>
         <w:tblStyle w:val="TableGrid"/>
@@ -3295,15 +3286,6 @@
         <w:t>문제는 어떻게 특정 인스턴스에 붙이느냐다. 서비스 `racdb` 는 양쪽에서 돌므로 SCAN 으로 붙으면 어디로 갈지 모른다.</w:t>
       </w:r>
     </w:p>
-    <w:p>
-      <w:r>
-        <w:rPr>
-          <w:rFonts w:ascii="맑은 고딕" w:hAnsi="맑은 고딕" w:eastAsia="맑은 고딕"/>
-          <w:sz w:val="21"/>
-        </w:rPr>
-        <w:t>방법은 노드의 VIP 로 붙는 것이다. 15장에서 확인했듯 로컬 리스너는 그 노드의 인스턴스만 등록한다.</w:t>
-      </w:r>
-    </w:p>
     <w:tbl>
       <w:tblPr>
         <w:tblStyle w:val="TableGrid"/>
@@ -3584,15 +3566,6 @@
       </w:tr>
     </w:tbl>
     <w:p/>
-    <w:p>
-      <w:r>
-        <w:rPr>
-          <w:rFonts w:ascii="맑은 고딕" w:hAnsi="맑은 고딕" w:eastAsia="맑은 고딕"/>
-          <w:sz w:val="21"/>
-        </w:rPr>
-        <w:t>채널 할당 메시지에 `instance=racdb1` 과 `instance=racdb2` 가 나온다. 의도한 대로 나뉘었다.</w:t>
-      </w:r>
-    </w:p>
     <w:p>
       <w:r>
         <w:rPr>
@@ -4356,15 +4329,6 @@
         <w:t>17.5.1 무엇을 복구하는가</w:t>
       </w:r>
     </w:p>
-    <w:p>
-      <w:r>
-        <w:rPr>
-          <w:rFonts w:ascii="맑은 고딕" w:hAnsi="맑은 고딕" w:eastAsia="맑은 고딕"/>
-          <w:sz w:val="21"/>
-        </w:rPr>
-        <w:t>13장에서 리두 스레드를 다루며 이렇게 말했다. 인스턴스 하나가 죽으면 살아남은 인스턴스가 죽은 인스턴스의 스레드를 읽어 복구한다.</w:t>
-      </w:r>
-    </w:p>
     <w:tbl>
       <w:tblPr>
         <w:tblStyle w:val="TableGrid"/>
@@ -4488,15 +4452,6 @@
       </w:tr>
     </w:tbl>
     <w:p/>
-    <w:p>
-      <w:r>
-        <w:rPr>
-          <w:rFonts w:ascii="맑은 고딕" w:hAnsi="맑은 고딕" w:eastAsia="맑은 고딕"/>
-          <w:sz w:val="21"/>
-        </w:rPr>
-        <w:t>`ESTIMATED_MTTR` 가 1 이다. 지금 인스턴스가 죽으면 약 1 초 만에 복구된다는 예측이다.</w:t>
-      </w:r>
-    </w:p>
     <w:p>
       <w:pPr>
         <w:pStyle w:val="Heading3"/>
@@ -4744,34 +4699,7 @@
           <w:rFonts w:ascii="맑은 고딕" w:hAnsi="맑은 고딕" w:eastAsia="맑은 고딕"/>
           <w:sz w:val="21"/>
         </w:rPr>
-        <w:t>15:10:14 에 rac1 이 알아차렸다. 죽인 지 약 5 초다.</w:t>
-      </w:r>
-    </w:p>
-    <w:p>
-      <w:r>
-        <w:rPr>
-          <w:rFonts w:ascii="맑은 고딕" w:hAnsi="맑은 고딕" w:eastAsia="맑은 고딕"/>
-          <w:sz w:val="21"/>
-        </w:rPr>
-        <w:t>`Reconfiguration started (old inc 4, new inc 6)` 이 클러스터 재구성의 시작이다. incarnation 번호가 4 에서 6 으로 올라간다.</w:t>
-      </w:r>
-    </w:p>
-    <w:p>
-      <w:r>
-        <w:rPr>
-          <w:rFonts w:ascii="맑은 고딕" w:hAnsi="맑은 고딕" w:eastAsia="맑은 고딕"/>
-          <w:sz w:val="21"/>
-        </w:rPr>
         <w:t>`Global Resource Directory frozen` 이 중요하다. 캐시 퓨전의 자원 목록을 잠시 얼린다. 이 동안 블록을 주고받을 수 없으므로 짧은 정지가 생긴다.</w:t>
-      </w:r>
-    </w:p>
-    <w:p>
-      <w:r>
-        <w:rPr>
-          <w:rFonts w:ascii="맑은 고딕" w:hAnsi="맑은 고딕" w:eastAsia="맑은 고딕"/>
-          <w:sz w:val="21"/>
-        </w:rPr>
-        <w:t>재구성 자체는 0.1 초다.</w:t>
       </w:r>
     </w:p>
     <w:tbl>
@@ -5211,15 +5139,6 @@
           <w:rFonts w:ascii="맑은 고딕" w:hAnsi="맑은 고딕" w:eastAsia="맑은 고딕"/>
           <w:sz w:val="21"/>
         </w:rPr>
-        <w:t>racdb2 는 57 초 만에 CRS 가 되살렸다. 12장에서 확인한 자동 복구이며 15장에서 61 초, 47 초로 쟀던 그 동작이다.</w:t>
-      </w:r>
-    </w:p>
-    <w:p>
-      <w:r>
-        <w:rPr>
-          <w:rFonts w:ascii="맑은 고딕" w:hAnsi="맑은 고딕" w:eastAsia="맑은 고딕"/>
-          <w:sz w:val="21"/>
-        </w:rPr>
         <w:t>두 시간을 구분해야 한다. 인스턴스 복구는 0.93 초이고 인스턴스 재기동은 57 초다.</w:t>
       </w:r>
     </w:p>
@@ -5809,15 +5728,6 @@
       </w:tr>
     </w:tbl>
     <w:p/>
-    <w:p>
-      <w:r>
-        <w:rPr>
-          <w:rFonts w:ascii="맑은 고딕" w:hAnsi="맑은 고딕" w:eastAsia="맑은 고딕"/>
-          <w:sz w:val="21"/>
-        </w:rPr>
-        <w:t>오프라인으로 만든 뒤에 지웠다는 점이 중요하다. 온라인 상태의 데이터파일은 ASM 이 사용 중으로 보아 삭제를 막을 수 있다.</w:t>
-      </w:r>
-    </w:p>
     <w:tbl>
       <w:tblPr>
         <w:tblStyle w:val="TableGrid"/>
@@ -5928,15 +5838,6 @@
       </w:tr>
     </w:tbl>
     <w:p/>
-    <w:p>
-      <w:r>
-        <w:rPr>
-          <w:rFonts w:ascii="맑은 고딕" w:hAnsi="맑은 고딕" w:eastAsia="맑은 고딕"/>
-          <w:sz w:val="21"/>
-        </w:rPr>
-        <w:t>rac2 에서도 같은 오류다. 파일이 공유 스토리지에 있었으므로 장애도 공유된다.</w:t>
-      </w:r>
-    </w:p>
     <w:p>
       <w:r>
         <w:rPr>
@@ -6194,15 +6095,6 @@
       </w:tr>
     </w:tbl>
     <w:p/>
-    <w:p>
-      <w:r>
-        <w:rPr>
-          <w:rFonts w:ascii="맑은 고딕" w:hAnsi="맑은 고딕" w:eastAsia="맑은 고딕"/>
-          <w:sz w:val="21"/>
-        </w:rPr>
-        <w:t>두 단계가 나뉘어 있다. `restore` 는 백업에서 파일을 되살리고 `recover` 는 백업 이후의 리두를 적용한다. 백업 시점과 장애 시점 사이의 변경이 리두에 있으므로 둘 다 필요하다.</w:t>
-      </w:r>
-    </w:p>
     <w:tbl>
       <w:tblPr>
         <w:tblStyle w:val="TableGrid"/>
@@ -6313,15 +6205,6 @@
       </w:tr>
     </w:tbl>
     <w:p/>
-    <w:p>
-      <w:r>
-        <w:rPr>
-          <w:rFonts w:ascii="맑은 고딕" w:hAnsi="맑은 고딕" w:eastAsia="맑은 고딕"/>
-          <w:sz w:val="21"/>
-        </w:rPr>
-        <w:t>파일 이름을 잘 보면 끝의 숫자가 바뀌었다. 원래 `ts_ch17.279.1243091315` 였는데 복원 후 `ts_ch17.279.1243091377` 이다.</w:t>
-      </w:r>
-    </w:p>
     <w:tbl>
       <w:tblPr>
         <w:tblStyle w:val="TableGrid"/>
@@ -6380,15 +6263,6 @@
       </w:tr>
     </w:tbl>
     <w:p/>
-    <w:p>
-      <w:r>
-        <w:rPr>
-          <w:rFonts w:ascii="맑은 고딕" w:hAnsi="맑은 고딕" w:eastAsia="맑은 고딕"/>
-          <w:sz w:val="21"/>
-        </w:rPr>
-        <w:t>복구 후 반드시 다른 노드에서도 확인한다. 10장과 17.2 절에서 본 것처럼 한 노드에서만 되는 상황이 있을 수 있기 때문이다.</w:t>
-      </w:r>
-    </w:p>
     <w:p>
       <w:pPr>
         <w:pStyle w:val="Heading2"/>
@@ -6581,15 +6455,6 @@
     </w:tbl>
     <w:p/>
     <w:p>
-      <w:r>
-        <w:rPr>
-          <w:rFonts w:ascii="맑은 고딕" w:hAnsi="맑은 고딕" w:eastAsia="맑은 고딕"/>
-          <w:sz w:val="21"/>
-        </w:rPr>
-        <w:t>둘 다 ASM 에 있다는 것이 RAC 의 조건이다. 로컬에 두면 그 노드가 죽었을 때 다른 노드가 데이터베이스를 올릴 수 없다.</w:t>
-      </w:r>
-    </w:p>
-    <w:p>
       <w:pPr>
         <w:pStyle w:val="Heading3"/>
       </w:pPr>
@@ -6796,7 +6661,7 @@
         <w:pStyle w:val="Heading3"/>
       </w:pPr>
       <w:r>
-        <w:t>17.7.3 SPFILE 복원 검증</w:t>
+        <w:t>17.7.3 SPFILE 복원 검증 — 그리고 그 부작용</w:t>
       </w:r>
     </w:p>
     <w:p>
@@ -6805,7 +6670,7 @@
           <w:rFonts w:ascii="맑은 고딕" w:hAnsi="맑은 고딕" w:eastAsia="맑은 고딕"/>
           <w:sz w:val="21"/>
         </w:rPr>
-        <w:t>컨트롤파일을 실제로 지우고 복구하는 실습은 위험하다. 대신 SPFILE 을 임시 위치로 복원해 자동 백업이 쓸 만한지 확인한다. 비파괴적이며 실제 복구 절차와 같은 명령을 쓴다.</w:t>
+        <w:t>컨트롤파일을 실제로 지우고 복구하는 실습은 위험하다. 대신 SPFILE 을 임시 위치로 복원해 자동 백업이 쓸 만한지 확인한다. 실제 복구 절차와 같은 명령을 쓰면서 데이터베이스는 건드리지 않는다.</w:t>
       </w:r>
     </w:p>
     <w:tbl>
@@ -7089,6 +6954,281 @@
         <w:t>`racdb1.` 과 `racdb2.` 접두어가 보인다. 12장에서 다룬 RAC SPFILE 의 표기다. 인스턴스별 항목이 그대로 백업되어 있다.</w:t>
       </w:r>
     </w:p>
+    <w:p>
+      <w:pPr>
+        <w:pStyle w:val="Heading3"/>
+      </w:pPr>
+      <w:r>
+        <w:t>17.7.4 읽기 전용처럼 보이지만 아니다</w:t>
+      </w:r>
+    </w:p>
+    <w:p>
+      <w:r>
+        <w:rPr>
+          <w:rFonts w:ascii="맑은 고딕" w:hAnsi="맑은 고딕" w:eastAsia="맑은 고딕"/>
+          <w:sz w:val="21"/>
+        </w:rPr>
+        <w:t>위 명령을 실행한 뒤 CRS 에 등록된 SPFILE 위치를 확인하면 놀라운 것이 나온다.</w:t>
+      </w:r>
+    </w:p>
+    <w:tbl>
+      <w:tblPr>
+        <w:tblStyle w:val="TableGrid"/>
+        <w:tblW w:type="auto" w:w="0"/>
+        <w:tblLook w:firstColumn="1" w:firstRow="1" w:lastColumn="0" w:lastRow="0" w:noHBand="0" w:noVBand="1" w:val="04A0"/>
+      </w:tblPr>
+      <w:tblGrid>
+        <w:gridCol w:w="8640"/>
+      </w:tblGrid>
+      <w:tr>
+        <w:tc>
+          <w:tcPr>
+            <w:tcW w:type="dxa" w:w="8640"/>
+            <w:shd w:val="clear" w:color="auto" w:fill="1E1E1E"/>
+          </w:tcPr>
+          <w:p>
+            <w:pPr>
+              <w:spacing w:after="0" w:before="0"/>
+            </w:pPr>
+            <w:r>
+              <w:rPr>
+                <w:rFonts w:ascii="Consolas" w:hAnsi="Consolas" w:eastAsia="Consolas"/>
+                <w:color w:val="F2F2F2"/>
+                <w:sz w:val="19"/>
+              </w:rPr>
+              <w:t>-- 세 시점에서 같은 조회를 한다</w:t>
+            </w:r>
+          </w:p>
+          <w:p>
+            <w:pPr>
+              <w:spacing w:after="0" w:before="0"/>
+            </w:pPr>
+            <w:r>
+              <w:rPr>
+                <w:rFonts w:ascii="Consolas" w:hAnsi="Consolas" w:eastAsia="Consolas"/>
+                <w:color w:val="F2F2F2"/>
+                <w:sz w:val="19"/>
+              </w:rPr>
+              <w:t>--   srvctl config database -d racdb | grep -i spfile</w:t>
+            </w:r>
+          </w:p>
+          <w:p>
+            <w:pPr>
+              <w:spacing w:after="0" w:before="0"/>
+            </w:pPr>
+            <w:r>
+              <w:rPr>
+                <w:rFonts w:ascii="Consolas" w:hAnsi="Consolas" w:eastAsia="Consolas"/>
+                <w:color w:val="F2F2F2"/>
+                <w:sz w:val="19"/>
+              </w:rPr>
+              <w:t xml:space="preserve"> </w:t>
+            </w:r>
+          </w:p>
+          <w:p>
+            <w:pPr>
+              <w:spacing w:after="0" w:before="0"/>
+            </w:pPr>
+            <w:r>
+              <w:rPr>
+                <w:rFonts w:ascii="Consolas" w:hAnsi="Consolas" w:eastAsia="Consolas"/>
+                <w:color w:val="F2F2F2"/>
+                <w:sz w:val="19"/>
+              </w:rPr>
+              <w:t>복원 전                        Spfile: +DATA/RACDB/PARAMETERFILE/spfile.272...</w:t>
+            </w:r>
+          </w:p>
+          <w:p>
+            <w:pPr>
+              <w:spacing w:after="0" w:before="0"/>
+            </w:pPr>
+            <w:r>
+              <w:rPr>
+                <w:rFonts w:ascii="Consolas" w:hAnsi="Consolas" w:eastAsia="Consolas"/>
+                <w:color w:val="F2F2F2"/>
+                <w:sz w:val="19"/>
+              </w:rPr>
+              <w:t>backup current controlfile 후  Spfile: +DATA/RACDB/PARAMETERFILE/spfile.272...</w:t>
+            </w:r>
+          </w:p>
+          <w:p>
+            <w:pPr>
+              <w:spacing w:after="0" w:before="0"/>
+            </w:pPr>
+            <w:r>
+              <w:rPr>
+                <w:rFonts w:ascii="Consolas" w:hAnsi="Consolas" w:eastAsia="Consolas"/>
+                <w:color w:val="F2F2F2"/>
+                <w:sz w:val="19"/>
+              </w:rPr>
+              <w:t>restore spfile to '/tmp/...' 후 Spfile: /tmp/sp_probe.ora      ← 바뀌었다</w:t>
+            </w:r>
+          </w:p>
+        </w:tc>
+      </w:tr>
+    </w:tbl>
+    <w:p/>
+    <w:p>
+      <w:r>
+        <w:rPr>
+          <w:rFonts w:ascii="맑은 고딕" w:hAnsi="맑은 고딕" w:eastAsia="맑은 고딕"/>
+          <w:sz w:val="21"/>
+        </w:rPr>
+        <w:t>이것이 왜 위험한가. 지금 돌고 있는 인스턴스는 영향을 받지 않는다. 이미 기동할 때 읽은 SPFILE 을 계속 쓰기 때문이다.</w:t>
+      </w:r>
+    </w:p>
+    <w:tbl>
+      <w:tblPr>
+        <w:tblStyle w:val="TableGrid"/>
+        <w:tblW w:type="auto" w:w="0"/>
+        <w:tblLook w:firstColumn="1" w:firstRow="1" w:lastColumn="0" w:lastRow="0" w:noHBand="0" w:noVBand="1" w:val="04A0"/>
+      </w:tblPr>
+      <w:tblGrid>
+        <w:gridCol w:w="8640"/>
+      </w:tblGrid>
+      <w:tr>
+        <w:tc>
+          <w:tcPr>
+            <w:tcW w:type="dxa" w:w="8640"/>
+            <w:shd w:val="clear" w:color="auto" w:fill="1E1E1E"/>
+          </w:tcPr>
+          <w:p>
+            <w:pPr>
+              <w:spacing w:after="0" w:before="0"/>
+            </w:pPr>
+            <w:r>
+              <w:rPr>
+                <w:rFonts w:ascii="Consolas" w:hAnsi="Consolas" w:eastAsia="Consolas"/>
+                <w:color w:val="F2F2F2"/>
+                <w:sz w:val="19"/>
+              </w:rPr>
+              <w:t>SQL&gt; select inst_id, value from gv$parameter where name='spfile';</w:t>
+            </w:r>
+          </w:p>
+          <w:p>
+            <w:pPr>
+              <w:spacing w:after="0" w:before="0"/>
+            </w:pPr>
+            <w:r>
+              <w:rPr>
+                <w:rFonts w:ascii="Consolas" w:hAnsi="Consolas" w:eastAsia="Consolas"/>
+                <w:color w:val="F2F2F2"/>
+                <w:sz w:val="19"/>
+              </w:rPr>
+              <w:t xml:space="preserve">   두 인스턴스 모두 +DATA/RACDB/PARAMETERFILE/spfile.272.1242762487</w:t>
+            </w:r>
+          </w:p>
+        </w:tc>
+      </w:tr>
+    </w:tbl>
+    <w:p/>
+    <w:p>
+      <w:r>
+        <w:rPr>
+          <w:rFonts w:ascii="맑은 고딕" w:hAnsi="맑은 고딕" w:eastAsia="맑은 고딕"/>
+          <w:sz w:val="21"/>
+        </w:rPr>
+        <w:t>문제는 다음 기동 때 터진다. `srvctl` 로 데이터베이스를 올리면 CRS 에 등록된 경로를 쓴다. 그 경로가 임시 파일이고, 실습을 정리하며 그것을 지웠다면 SPFILE 없이 기동하게 된다.</w:t>
+      </w:r>
+    </w:p>
+    <w:p>
+      <w:r>
+        <w:rPr>
+          <w:rFonts w:ascii="맑은 고딕" w:hAnsi="맑은 고딕" w:eastAsia="맑은 고딕"/>
+          <w:sz w:val="21"/>
+        </w:rPr>
+        <w:t>즉 검증한 그날은 멀쩡하고 몇 주 뒤 계획 정지 후 재기동에서 문제가 드러난다. 진단하기 가장 어려운 종류의 사고다.</w:t>
+      </w:r>
+    </w:p>
+    <w:tbl>
+      <w:tblPr>
+        <w:tblStyle w:val="TableGrid"/>
+        <w:tblW w:type="auto" w:w="0"/>
+        <w:tblLook w:firstColumn="1" w:firstRow="1" w:lastColumn="0" w:lastRow="0" w:noHBand="0" w:noVBand="1" w:val="04A0"/>
+      </w:tblPr>
+      <w:tblGrid>
+        <w:gridCol w:w="8640"/>
+      </w:tblGrid>
+      <w:tr>
+        <w:tc>
+          <w:tcPr>
+            <w:tcW w:type="dxa" w:w="8640"/>
+            <w:shd w:val="clear" w:color="auto" w:fill="E3F0DB"/>
+          </w:tcPr>
+          <w:p>
+            <w:r>
+              <w:rPr>
+                <w:rFonts w:ascii="맑은 고딕" w:hAnsi="맑은 고딕" w:eastAsia="맑은 고딕"/>
+                <w:b/>
+                <w:sz w:val="21"/>
+              </w:rPr>
+              <w:t>Best Practice · restore spfile 뒤에는 반드시 등록 정보를 되돌린다</w:t>
+            </w:r>
+          </w:p>
+          <w:p>
+            <w:pPr>
+              <w:spacing w:after="20"/>
+            </w:pPr>
+            <w:r>
+              <w:rPr>
+                <w:rFonts w:ascii="맑은 고딕" w:hAnsi="맑은 고딕" w:eastAsia="맑은 고딕"/>
+                <w:sz w:val="20"/>
+              </w:rPr>
+              <w:t>명령 이름에 restore 가 들어 있어 읽기 전용처럼 느껴지지만 아니다. 복원 대상 위치를 CRS 에 알려 주는 것까지가 이 명령의 동작이다.</w:t>
+            </w:r>
+          </w:p>
+          <w:p>
+            <w:pPr>
+              <w:spacing w:after="20"/>
+            </w:pPr>
+            <w:r>
+              <w:rPr>
+                <w:rFonts w:ascii="맑은 고딕" w:hAnsi="맑은 고딕" w:eastAsia="맑은 고딕"/>
+                <w:sz w:val="20"/>
+              </w:rPr>
+              <w:t>그러므로 검증 목적으로 임시 위치에 복원했다면 반드시 원래 값으로 되돌린다.</w:t>
+            </w:r>
+          </w:p>
+          <w:p>
+            <w:pPr>
+              <w:spacing w:after="20"/>
+            </w:pPr>
+            <w:r>
+              <w:rPr>
+                <w:rFonts w:ascii="맑은 고딕" w:hAnsi="맑은 고딕" w:eastAsia="맑은 고딕"/>
+                <w:sz w:val="20"/>
+              </w:rPr>
+              <w:t>`srvctl modify database -d racdb -spfile '+DATA/RACDB/PARAMETERFILE/spfile.272.1242762487'`</w:t>
+            </w:r>
+          </w:p>
+          <w:p>
+            <w:pPr>
+              <w:spacing w:after="20"/>
+            </w:pPr>
+            <w:r>
+              <w:rPr>
+                <w:rFonts w:ascii="맑은 고딕" w:hAnsi="맑은 고딕" w:eastAsia="맑은 고딕"/>
+                <w:sz w:val="20"/>
+              </w:rPr>
+              <w:t>더 안전한 방법도 있다. 검증만 목적이라면 SPFILE 대신 컨트롤파일 자동 백업의 존재만 확인해도 된다. `list backup of spfile` 과 `list backup of controlfile` 로 최근 자동 백업이 있는지 보는 것이다. 등록 정보를 건드리지 않는다.</w:t>
+            </w:r>
+          </w:p>
+          <w:p>
+            <w:pPr>
+              <w:spacing w:after="20"/>
+            </w:pPr>
+            <w:r>
+              <w:rPr>
+                <w:rFonts w:ascii="맑은 고딕" w:hAnsi="맑은 고딕" w:eastAsia="맑은 고딕"/>
+                <w:sz w:val="20"/>
+              </w:rPr>
+              <w:t>일반화하면 이렇다. RMAN 의 restore 계열은 데이터를 되살리는 동시에 그 위치를 카탈로그와 CRS 에 반영한다. "읽기만 하는 명령" 은 `validate` 계열이고 `restore` 는 이름과 달리 상태를 바꾼다.</w:t>
+            </w:r>
+          </w:p>
+        </w:tc>
+      </w:tr>
+    </w:tbl>
+    <w:p/>
     <w:tbl>
       <w:tblPr>
         <w:tblStyle w:val="TableGrid"/>
@@ -7683,6 +7823,15 @@
           <w:sz w:val="21"/>
         </w:rPr>
         <w:t>SPFILE 에 `log_archive_dest_1` 이 지정되지 않았다. 17.2 절의 변경이 `scope=memory` 였으므로 남지 않았다.</w:t>
+      </w:r>
+    </w:p>
+    <w:p>
+      <w:r>
+        <w:rPr>
+          <w:rFonts w:ascii="맑은 고딕" w:hAnsi="맑은 고딕" w:eastAsia="맑은 고딕"/>
+          <w:sz w:val="21"/>
+        </w:rPr>
+        <w:t>SPFILE 등록 정보도 `srvctl config database -d racdb | grep -i spfile` 로 확인한다. 17.7.4 절에서 임시 경로로 바뀌었으므로 되돌려 두어야 한다. 이것을 빠뜨리면 다음 재기동에서 문제가 생긴다.</w:t>
       </w:r>
     </w:p>
     <w:p>
@@ -7950,15 +8099,6 @@
       </w:tr>
     </w:tbl>
     <w:p/>
-    <w:p>
-      <w:r>
-        <w:rPr>
-          <w:rFonts w:ascii="맑은 고딕" w:hAnsi="맑은 고딕" w:eastAsia="맑은 고딕"/>
-          <w:sz w:val="21"/>
-        </w:rPr>
-        <w:t>운영에서는 `CONFIGURE ARCHIVELOG DELETION POLICY TO BACKED UP 1 TIMES TO DISK` 를 걸어 두는 것이 출발점이다. 그러면 FRA 가 찰 때 오라클이 백업된 아카이브를 자동으로 지운다.</w:t>
-      </w:r>
-    </w:p>
     <w:p>
       <w:pPr>
         <w:pStyle w:val="Heading3"/>
@@ -8434,7 +8574,25 @@
           <w:rFonts w:ascii="맑은 고딕" w:hAnsi="맑은 고딕" w:eastAsia="맑은 고딕"/>
           <w:sz w:val="21"/>
         </w:rPr>
-        <w:t>`restore spfile to '&lt;임시경로&gt;' from autobackup` 은 비파괴적이다. 자동 백업이 쓸 만한지 운영 중에 확인할 수 있다. 복원한 SPFILE 에 `racdb1.` 과 `racdb2.` 접두어가 그대로 있었다.</w:t>
+        <w:t>`restore spfile to '&lt;임시경로&gt;' from autobackup` 으로 자동 백업이 쓸 만한지 운영 중에 확인할 수 있다. 복원한 SPFILE 에 `racdb1.` 과 `racdb2.` 접두어가 그대로 있었다.</w:t>
+      </w:r>
+    </w:p>
+    <w:p>
+      <w:r>
+        <w:rPr>
+          <w:rFonts w:ascii="맑은 고딕" w:hAnsi="맑은 고딕" w:eastAsia="맑은 고딕"/>
+          <w:sz w:val="21"/>
+        </w:rPr>
+        <w:t>그런데 이 명령은 읽기 전용이 아니다. 실행하면 CRS 에 등록된 SPFILE 위치가 그 임시 경로로 바뀐다. 백업만 했을 때는 바뀌지 않았으므로 원인이 이 명령임을 대조로 확인했다.</w:t>
+      </w:r>
+    </w:p>
+    <w:p>
+      <w:r>
+        <w:rPr>
+          <w:rFonts w:ascii="맑은 고딕" w:hAnsi="맑은 고딕" w:eastAsia="맑은 고딕"/>
+          <w:sz w:val="21"/>
+        </w:rPr>
+        <w:t>실행 중인 인스턴스는 영향을 받지 않아 그날은 멀쩡해 보인다. 문제는 다음 `srvctl` 기동 때 드러난다. 그래서 복원 전에 원래 값을 기록하고 끝나면 `srvctl modify database -spfile` 로 되돌려야 한다.</w:t>
       </w:r>
     </w:p>
     <w:p>

</xml_diff>